<commit_message>
Update developer brief to v1.1 (code on GitHub)
Co-authored-by: ADD0489 <ADD0489@users.noreply.github.com>
</commit_message>
<xml_diff>
--- a/Staff_Timesheet_View_Developer_Brief.docx
+++ b/Staff_Timesheet_View_Developer_Brief.docx
@@ -9,7 +9,7 @@
           <w:color w:val="1F3A5F"/>
           <w:sz w:val="40"/>
         </w:rPr>
-        <w:t>Staff Timesheet View – Developer Brief</w:t>
+        <w:t>Staff Timesheet View: Developer Brief</w:t>
       </w:r>
     </w:p>
     <w:p>
@@ -18,7 +18,7 @@
           <w:color w:val="444444"/>
           <w:sz w:val="24"/>
         </w:rPr>
-        <w:t>Inspire Kitchens | Handoff 7 Oct 2026</w:t>
+        <w:t>Inspire Kitchens | Version 1.1, 7 Oct 2026 (code on GitHub)</w:t>
       </w:r>
     </w:p>
     <w:p>
@@ -41,6 +41,14 @@
     <w:p>
       <w:r>
         <w:t>The app is built and tested locally but not deployed. Your job is to stand up the hosting and email accounts, deploy, prove one change-request email end to end to Aaron only, then wait for Aaron's go-ahead before any staff link is issued. The go-live checklist is in section 4.</w:t>
+      </w:r>
+    </w:p>
+    <w:p>
+      <w:pPr>
+        <w:pStyle w:val="Heading2"/>
+      </w:pPr>
+      <w:r>
+        <w:t>Getting the code</w:t>
       </w:r>
     </w:p>
     <w:p>
@@ -49,17 +57,111 @@
         <w:spacing w:after="40"/>
       </w:pPr>
       <w:r>
-        <w:t xml:space="preserve">Get a copy of </w:t>
+        <w:rPr>
+          <w:b/>
+        </w:rPr>
+        <w:t xml:space="preserve">Repo: </w:t>
+      </w:r>
+      <w:r>
+        <w:t>https://github.com/ADD0489/Inspire-timesheet (private; keep it private).</w:t>
+      </w:r>
+    </w:p>
+    <w:p>
+      <w:pPr>
+        <w:pStyle w:val="ListBullet"/>
+        <w:spacing w:after="40"/>
+      </w:pPr>
+      <w:r>
+        <w:rPr>
+          <w:b/>
+        </w:rPr>
+        <w:t xml:space="preserve">Draft pull request #1: </w:t>
+      </w:r>
+      <w:r>
+        <w:t xml:space="preserve">https://github.com/ADD0489/Inspire-timesheet/pull/1, branch </w:t>
       </w:r>
       <w:r>
         <w:rPr>
           <w:rFonts w:ascii="Consolas" w:hAnsi="Consolas"/>
           <w:sz w:val="19"/>
         </w:rPr>
-        <w:t>/workspace/staff-timesheet-view/</w:t>
-      </w:r>
-      <w:r>
-        <w:t xml:space="preserve"> from the agent box (zip or repo). If you put it in git, do not commit </w:t>
+        <w:t>initial-draft</w:t>
+      </w:r>
+      <w:r>
+        <w:t xml:space="preserve"> into </w:t>
+      </w:r>
+      <w:r>
+        <w:rPr>
+          <w:rFonts w:ascii="Consolas" w:hAnsi="Consolas"/>
+          <w:sz w:val="19"/>
+        </w:rPr>
+        <w:t>main</w:t>
+      </w:r>
+      <w:r>
+        <w:t xml:space="preserve">. </w:t>
+      </w:r>
+      <w:r>
+        <w:rPr>
+          <w:rFonts w:ascii="Consolas" w:hAnsi="Consolas"/>
+          <w:sz w:val="19"/>
+        </w:rPr>
+        <w:t>main</w:t>
+      </w:r>
+      <w:r>
+        <w:t xml:space="preserve"> has only a one-line README. The PR has 40 files: the project at the repo root plus </w:t>
+      </w:r>
+      <w:r>
+        <w:rPr>
+          <w:rFonts w:ascii="Consolas" w:hAnsi="Consolas"/>
+          <w:sz w:val="19"/>
+        </w:rPr>
+        <w:t>.gitignore</w:t>
+      </w:r>
+      <w:r>
+        <w:t>.</w:t>
+      </w:r>
+    </w:p>
+    <w:p>
+      <w:pPr>
+        <w:pStyle w:val="ListBullet"/>
+        <w:spacing w:after="40"/>
+      </w:pPr>
+      <w:r>
+        <w:t>Review PR #1, then merge it when ready (Aaron's call on timing). All new work goes on branches and pull requests.</w:t>
+      </w:r>
+    </w:p>
+    <w:p>
+      <w:pPr>
+        <w:pStyle w:val="ListBullet"/>
+        <w:spacing w:after="40"/>
+      </w:pPr>
+      <w:r>
+        <w:t>A fuller zip with sample data exists in Drive (Staff_Timesheet_View_Handoff_7Oct2026.zip) but contains real staff hours, so share it only with Aaron's OK.</w:t>
+      </w:r>
+    </w:p>
+    <w:p>
+      <w:pPr>
+        <w:pStyle w:val="Heading2"/>
+      </w:pPr>
+      <w:r>
+        <w:t>What is NOT in the repo</w:t>
+      </w:r>
+    </w:p>
+    <w:p>
+      <w:pPr>
+        <w:pStyle w:val="ListBullet"/>
+        <w:spacing w:after="40"/>
+      </w:pPr>
+      <w:r/>
+      <w:r>
+        <w:rPr>
+          <w:rFonts w:ascii="Consolas" w:hAnsi="Consolas"/>
+          <w:sz w:val="19"/>
+        </w:rPr>
+        <w:t>.gitignore</w:t>
+      </w:r>
+      <w:r>
+        <w:t xml:space="preserve"> excludes </w:t>
       </w:r>
       <w:r>
         <w:rPr>
@@ -69,17 +171,262 @@
         <w:t>secrets/</w:t>
       </w:r>
       <w:r>
-        <w:t xml:space="preserve"> (raw tokens) or any env file; add them to </w:t>
+        <w:t xml:space="preserve"> (raw staff link tokens), </w:t>
       </w:r>
       <w:r>
         <w:rPr>
           <w:rFonts w:ascii="Consolas" w:hAnsi="Consolas"/>
           <w:sz w:val="19"/>
         </w:rPr>
-        <w:t>.gitignore</w:t>
-      </w:r>
-      <w:r>
-        <w:t xml:space="preserve"> first.</w:t>
+        <w:t>inputs/</w:t>
+      </w:r>
+      <w:r>
+        <w:t xml:space="preserve"> and </w:t>
+      </w:r>
+      <w:r>
+        <w:rPr>
+          <w:rFonts w:ascii="Consolas" w:hAnsi="Consolas"/>
+          <w:sz w:val="19"/>
+        </w:rPr>
+        <w:t>out/</w:t>
+      </w:r>
+      <w:r>
+        <w:t xml:space="preserve"> (real Jobman staff hours, payroll data), </w:t>
+      </w:r>
+      <w:r>
+        <w:rPr>
+          <w:rFonts w:ascii="Consolas" w:hAnsi="Consolas"/>
+          <w:sz w:val="19"/>
+        </w:rPr>
+        <w:t>probe/</w:t>
+      </w:r>
+      <w:r>
+        <w:t xml:space="preserve">, </w:t>
+      </w:r>
+      <w:r>
+        <w:rPr>
+          <w:rFonts w:ascii="Consolas" w:hAnsi="Consolas"/>
+          <w:sz w:val="19"/>
+        </w:rPr>
+        <w:t>data-sheet/</w:t>
+      </w:r>
+      <w:r>
+        <w:t xml:space="preserve">, </w:t>
+      </w:r>
+      <w:r>
+        <w:rPr>
+          <w:rFonts w:ascii="Consolas" w:hAnsi="Consolas"/>
+          <w:sz w:val="19"/>
+        </w:rPr>
+        <w:t>preview/</w:t>
+      </w:r>
+      <w:r>
+        <w:t xml:space="preserve">, </w:t>
+      </w:r>
+      <w:r>
+        <w:rPr>
+          <w:rFonts w:ascii="Consolas" w:hAnsi="Consolas"/>
+          <w:sz w:val="19"/>
+        </w:rPr>
+        <w:t>node_modules/</w:t>
+      </w:r>
+      <w:r>
+        <w:t xml:space="preserve">, </w:t>
+      </w:r>
+      <w:r>
+        <w:rPr>
+          <w:rFonts w:ascii="Consolas" w:hAnsi="Consolas"/>
+          <w:sz w:val="19"/>
+        </w:rPr>
+        <w:t>__pycache__/</w:t>
+      </w:r>
+      <w:r>
+        <w:t xml:space="preserve">, </w:t>
+      </w:r>
+      <w:r>
+        <w:rPr>
+          <w:rFonts w:ascii="Consolas" w:hAnsi="Consolas"/>
+          <w:sz w:val="19"/>
+        </w:rPr>
+        <w:t>.wrangler/</w:t>
+      </w:r>
+      <w:r>
+        <w:t xml:space="preserve">, </w:t>
+      </w:r>
+      <w:r>
+        <w:rPr>
+          <w:rFonts w:ascii="Consolas" w:hAnsi="Consolas"/>
+          <w:sz w:val="19"/>
+        </w:rPr>
+        <w:t>*.pyc</w:t>
+      </w:r>
+      <w:r>
+        <w:t xml:space="preserve">, </w:t>
+      </w:r>
+      <w:r>
+        <w:rPr>
+          <w:rFonts w:ascii="Consolas" w:hAnsi="Consolas"/>
+          <w:sz w:val="19"/>
+        </w:rPr>
+        <w:t>.env*</w:t>
+      </w:r>
+      <w:r>
+        <w:t xml:space="preserve"> and </w:t>
+      </w:r>
+      <w:r>
+        <w:rPr>
+          <w:rFonts w:ascii="Consolas" w:hAnsi="Consolas"/>
+          <w:sz w:val="19"/>
+        </w:rPr>
+        <w:t>.dev.vars</w:t>
+      </w:r>
+      <w:r>
+        <w:t>.</w:t>
+      </w:r>
+    </w:p>
+    <w:p>
+      <w:pPr>
+        <w:pStyle w:val="ListBullet"/>
+        <w:spacing w:after="40"/>
+      </w:pPr>
+      <w:r>
+        <w:t>Preview images and sample data stay on the assistant's computer; ask Aaron if you need them.</w:t>
+      </w:r>
+    </w:p>
+    <w:p>
+      <w:pPr>
+        <w:pStyle w:val="ListBullet"/>
+        <w:spacing w:after="40"/>
+      </w:pPr>
+      <w:r>
+        <w:t xml:space="preserve">Never commit secrets, tokens, real hours or </w:t>
+      </w:r>
+      <w:r>
+        <w:rPr>
+          <w:rFonts w:ascii="Consolas" w:hAnsi="Consolas"/>
+          <w:sz w:val="19"/>
+        </w:rPr>
+        <w:t>.env</w:t>
+      </w:r>
+      <w:r>
+        <w:t xml:space="preserve"> files.</w:t>
+      </w:r>
+    </w:p>
+    <w:p>
+      <w:pPr>
+        <w:pStyle w:val="Heading2"/>
+      </w:pPr>
+      <w:r>
+        <w:t>Sensitive but committed</w:t>
+      </w:r>
+    </w:p>
+    <w:p>
+      <w:pPr>
+        <w:pStyle w:val="ListBullet"/>
+        <w:spacing w:after="40"/>
+      </w:pPr>
+      <w:r/>
+      <w:r>
+        <w:rPr>
+          <w:rFonts w:ascii="Consolas" w:hAnsi="Consolas"/>
+          <w:sz w:val="19"/>
+        </w:rPr>
+        <w:t>pipeline/staff_ids.json</w:t>
+      </w:r>
+      <w:r>
+        <w:t xml:space="preserve"> has staff names and Jobman staff UUIDs; </w:t>
+      </w:r>
+      <w:r>
+        <w:rPr>
+          <w:rFonts w:ascii="Consolas" w:hAnsi="Consolas"/>
+          <w:sz w:val="19"/>
+        </w:rPr>
+        <w:t>pipeline/stv_pipeline.py</w:t>
+      </w:r>
+      <w:r>
+        <w:t xml:space="preserve"> has the Jobman organisation ID (</w:t>
+      </w:r>
+      <w:r>
+        <w:rPr>
+          <w:rFonts w:ascii="Consolas" w:hAnsi="Consolas"/>
+          <w:sz w:val="19"/>
+        </w:rPr>
+        <w:t>ORG_ID</w:t>
+      </w:r>
+      <w:r>
+        <w:t>). These are identifiers, not credentials, but they are why the repo must stay private.</w:t>
+      </w:r>
+    </w:p>
+    <w:p>
+      <w:pPr>
+        <w:pStyle w:val="ListBullet"/>
+        <w:spacing w:after="40"/>
+      </w:pPr>
+      <w:r>
+        <w:t>At commit time a secret scan found no API keys, client secrets, bearer tokens, private keys or raw tokens.</w:t>
+      </w:r>
+    </w:p>
+    <w:p>
+      <w:pPr>
+        <w:pStyle w:val="ListBullet"/>
+        <w:spacing w:after="40"/>
+      </w:pPr>
+      <w:r>
+        <w:rPr>
+          <w:b/>
+        </w:rPr>
+        <w:t xml:space="preserve">Credentials: </w:t>
+      </w:r>
+      <w:r>
+        <w:t>Cloudflare and Graph credentials go in Worker secrets (</w:t>
+      </w:r>
+      <w:r>
+        <w:rPr>
+          <w:rFonts w:ascii="Consolas" w:hAnsi="Consolas"/>
+          <w:sz w:val="19"/>
+        </w:rPr>
+        <w:t>wrangler secret put GRAPH_TENANT_ID</w:t>
+      </w:r>
+      <w:r>
+        <w:t xml:space="preserve">, </w:t>
+      </w:r>
+      <w:r>
+        <w:rPr>
+          <w:rFonts w:ascii="Consolas" w:hAnsi="Consolas"/>
+          <w:sz w:val="19"/>
+        </w:rPr>
+        <w:t>GRAPH_CLIENT_ID</w:t>
+      </w:r>
+      <w:r>
+        <w:t xml:space="preserve">, </w:t>
+      </w:r>
+      <w:r>
+        <w:rPr>
+          <w:rFonts w:ascii="Consolas" w:hAnsi="Consolas"/>
+          <w:sz w:val="19"/>
+        </w:rPr>
+        <w:t>GRAPH_CLIENT_SECRET</w:t>
+      </w:r>
+      <w:r>
+        <w:t xml:space="preserve">) or a local </w:t>
+      </w:r>
+      <w:r>
+        <w:rPr>
+          <w:rFonts w:ascii="Consolas" w:hAnsi="Consolas"/>
+          <w:sz w:val="19"/>
+        </w:rPr>
+        <w:t>.dev.vars</w:t>
+      </w:r>
+      <w:r>
+        <w:t xml:space="preserve"> (gitignored); never in the repo or KV. Use GitHub repo secrets only if you later add CI deploys.</w:t>
+      </w:r>
+    </w:p>
+    <w:p>
+      <w:pPr>
+        <w:pStyle w:val="Heading2"/>
+      </w:pPr>
+      <w:r>
+        <w:t>Before you start</w:t>
       </w:r>
     </w:p>
     <w:p>
@@ -282,7 +629,7 @@
               <w:rPr>
                 <w:sz w:val="19"/>
               </w:rPr>
-              <w:t>Built and tested on the agent box only</w:t>
+              <w:t>Built and tested on the assistant's computer only</w:t>
             </w:r>
           </w:p>
         </w:tc>
@@ -510,7 +857,7 @@
               <w:rPr>
                 <w:sz w:val="19"/>
               </w:rPr>
-              <w:t xml:space="preserve"> only</w:t>
+              <w:t xml:space="preserve"> on the assistant's computer only (not in the repo)</w:t>
             </w:r>
           </w:p>
         </w:tc>
@@ -598,19 +945,20 @@
               <w:rPr>
                 <w:sz w:val="19"/>
               </w:rPr>
+              <w:t xml:space="preserve">GitHub </w:t>
             </w:r>
             <w:r>
               <w:rPr>
                 <w:rFonts w:ascii="Consolas" w:hAnsi="Consolas"/>
                 <w:sz w:val="19"/>
               </w:rPr>
-              <w:t>/workspace/staff-timesheet-view/</w:t>
+              <w:t>ADD0489/Inspire-timesheet</w:t>
             </w:r>
             <w:r>
               <w:rPr>
                 <w:sz w:val="19"/>
               </w:rPr>
-              <w:t xml:space="preserve"> on the agent box</w:t>
+              <w:t xml:space="preserve"> (private), draft PR #1 awaiting review and merge</w:t>
             </w:r>
           </w:p>
         </w:tc>
@@ -646,7 +994,17 @@
         <w:t xml:space="preserve">Pipeline. </w:t>
       </w:r>
       <w:r>
-        <w:t>Nightly Python pipeline on the box: Jobman API (GET only) → build per-staff JSON → push changed keys to Cloudflare Workers KV. Runs 7:30pm NZ with a 10:00pm catch-up (</w:t>
+        <w:t>Nightly Python pipeline (</w:t>
+      </w:r>
+      <w:r>
+        <w:rPr>
+          <w:rFonts w:ascii="Consolas" w:hAnsi="Consolas"/>
+          <w:sz w:val="19"/>
+        </w:rPr>
+        <w:t>pipeline/stv_pipeline.py</w:t>
+      </w:r>
+      <w:r>
+        <w:t>, currently run on the assistant's computer): Jobman API (GET only) → build per-staff JSON → push changed keys to Cloudflare Workers KV. Runs 7:30pm NZ with a 10:00pm catch-up (</w:t>
       </w:r>
       <w:r>
         <w:rPr>
@@ -696,7 +1054,7 @@
         <w:t>cloudflare</w:t>
       </w:r>
       <w:r>
-        <w:t>).</w:t>
+        <w:t>). Where it runs long term (assistant's computer, a server or GitHub Actions) is for you and Aaron to decide.</w:t>
       </w:r>
     </w:p>
     <w:p>
@@ -1270,7 +1628,7 @@
                 <w:rFonts w:ascii="Consolas" w:hAnsi="Consolas"/>
                 <w:sz w:val="19"/>
               </w:rPr>
-              <w:t>preview/</w:t>
+              <w:t>superseded-google/</w:t>
             </w:r>
             <w:r>
               <w:rPr>
@@ -1293,7 +1651,7 @@
               <w:rPr>
                 <w:sz w:val="19"/>
               </w:rPr>
-              <w:t>Phone previews, request form, confirmation and sample email</w:t>
+              <w:t>Old Apps Script version; ignore it</w:t>
             </w:r>
           </w:p>
         </w:tc>
@@ -1325,6 +1683,7 @@
               <w:rPr>
                 <w:sz w:val="19"/>
               </w:rPr>
+              <w:t xml:space="preserve"> (not in repo)</w:t>
             </w:r>
           </w:p>
         </w:tc>
@@ -1355,7 +1714,7 @@
               <w:rPr>
                 <w:sz w:val="19"/>
               </w:rPr>
-              <w:t>, mode 600). Local only; never commit or upload</w:t>
+              <w:t>, mode 600) on the assistant's computer only. Never commit or upload</w:t>
             </w:r>
           </w:p>
         </w:tc>
@@ -1504,7 +1863,7 @@
         <w:t>CF_KV_NAMESPACE_ID</w:t>
       </w:r>
       <w:r>
-        <w:t xml:space="preserve"> in the box's private env file, never in code.</w:t>
+        <w:t xml:space="preserve"> in a private env file wherever the pipeline runs (gitignored), never in code.</w:t>
       </w:r>
     </w:p>
     <w:p>
@@ -1702,7 +2061,17 @@
         <w:t>src/mailer.js</w:t>
       </w:r>
       <w:r>
-        <w:t>). Secrets go into Cloudflare only, never code or KV.</w:t>
+        <w:t xml:space="preserve">). Secrets go into Cloudflare only (or a gitignored </w:t>
+      </w:r>
+      <w:r>
+        <w:rPr>
+          <w:rFonts w:ascii="Consolas" w:hAnsi="Consolas"/>
+          <w:sz w:val="19"/>
+        </w:rPr>
+        <w:t>.dev.vars</w:t>
+      </w:r>
+      <w:r>
+        <w:t xml:space="preserve"> for local dev), never the repo or KV.</w:t>
       </w:r>
     </w:p>
     <w:p>
@@ -2377,17 +2746,17 @@
         <w:t>config/change_requests.json</w:t>
       </w:r>
       <w:r>
-        <w:t xml:space="preserve"> (published to KV on every push). Team names must match </w:t>
+        <w:t xml:space="preserve"> (published to KV on every push). Team names must match the staff tab map (</w:t>
       </w:r>
       <w:r>
         <w:rPr>
           <w:rFonts w:ascii="Consolas" w:hAnsi="Consolas"/>
           <w:sz w:val="19"/>
         </w:rPr>
-        <w:t>/workspace/staff_tab_map.json</w:t>
-      </w:r>
-      <w:r>
-        <w:t>.</w:t>
+        <w:t>staff_tab_map.json</w:t>
+      </w:r>
+      <w:r>
+        <w:t>, kept on the assistant's computer outside the repo).</w:t>
       </w:r>
     </w:p>
     <w:tbl>
@@ -2557,7 +2926,7 @@
               <w:rPr>
                 <w:sz w:val="19"/>
               </w:rPr>
-              <w:t>Dan@inspirekitchens.co.nz (cover: aaron@inspirekitchens.co.nz 1–16 Oct 2026 inclusive)</w:t>
+              <w:t>Dan@inspirekitchens.co.nz (cover: aaron@inspirekitchens.co.nz 1 to 16 Oct 2026 inclusive)</w:t>
             </w:r>
           </w:p>
         </w:tc>
@@ -2659,27 +3028,37 @@
     </w:p>
     <w:p>
       <w:r>
-        <w:t xml:space="preserve">Full detail in DEPLOYMENT_AND_OPERATIONS.md section 10. Node 22 and wrangler are already under </w:t>
+        <w:t xml:space="preserve">Full detail in DEPLOYMENT_AND_OPERATIONS.md section 10. You need Node 22 and Python 3; run </w:t>
       </w:r>
       <w:r>
         <w:rPr>
           <w:rFonts w:ascii="Consolas" w:hAnsi="Consolas"/>
           <w:sz w:val="19"/>
         </w:rPr>
-        <w:t>/workspace/tools</w:t>
-      </w:r>
-      <w:r>
-        <w:t xml:space="preserve"> and </w:t>
+        <w:t>npm install</w:t>
+      </w:r>
+      <w:r>
+        <w:t xml:space="preserve"> in </w:t>
       </w:r>
       <w:r>
         <w:rPr>
           <w:rFonts w:ascii="Consolas" w:hAnsi="Consolas"/>
           <w:sz w:val="19"/>
         </w:rPr>
-        <w:t>cloudflare/node_modules</w:t>
-      </w:r>
-      <w:r>
-        <w:t xml:space="preserve"> on the box.</w:t>
+        <w:t>cloudflare/</w:t>
+      </w:r>
+      <w:r>
+        <w:t xml:space="preserve"> first (</w:t>
+      </w:r>
+      <w:r>
+        <w:rPr>
+          <w:rFonts w:ascii="Consolas" w:hAnsi="Consolas"/>
+          <w:sz w:val="19"/>
+        </w:rPr>
+        <w:t>node_modules/</w:t>
+      </w:r>
+      <w:r>
+        <w:t xml:space="preserve"> is not committed).</w:t>
       </w:r>
     </w:p>
     <w:p>
@@ -2695,7 +3074,7 @@
           <w:rFonts w:ascii="Consolas" w:hAnsi="Consolas"/>
           <w:sz w:val="19"/>
         </w:rPr>
-        <w:t>cd cloudflare &amp;&amp; PATH=/workspace/tools/node22/bin:$PATH npm run dev</w:t>
+        <w:t>cd cloudflare &amp;&amp; npm run dev</w:t>
       </w:r>
       <w:r>
         <w:t xml:space="preserve"> (runs </w:t>
@@ -2804,7 +3183,7 @@
         <w:t>preview/</w:t>
       </w:r>
       <w:r>
-        <w:t>.</w:t>
+        <w:t xml:space="preserve"> on the assistant's computer (not in the repo); ask Aaron for copies.</w:t>
       </w:r>
     </w:p>
     <w:p>
@@ -2863,16 +3242,8 @@
         <w:pStyle w:val="ListBullet"/>
         <w:spacing w:after="40"/>
       </w:pPr>
-      <w:r/>
-      <w:r>
-        <w:rPr>
-          <w:rFonts w:ascii="Consolas" w:hAnsi="Consolas"/>
-          <w:sz w:val="19"/>
-        </w:rPr>
-        <w:t>superseded-google/</w:t>
-      </w:r>
-      <w:r>
-        <w:t xml:space="preserve"> is the old Apps Script version; ignore it.</w:t>
+      <w:r>
+        <w:t>Repo and PR: https://github.com/ADD0489/Inspire-timesheet/pull/1.</w:t>
       </w:r>
     </w:p>
     <w:sectPr>
@@ -2898,7 +3269,7 @@
       <w:rPr>
         <w:sz w:val="17"/>
       </w:rPr>
-      <w:t xml:space="preserve">Handoff 7 Oct 2026 | Internal | Page </w:t>
+      <w:t xml:space="preserve">Version 1.1, 7 Oct 2026 | Internal | Private | Page </w:t>
     </w:r>
     <w:r>
       <w:rPr>
@@ -2923,7 +3294,7 @@
         <w:color w:val="666666"/>
         <w:sz w:val="17"/>
       </w:rPr>
-      <w:t>Inspire Kitchens | Staff Timesheet View – Developer Brief</w:t>
+      <w:t>Inspire Kitchens | Staff Timesheet View: Developer Brief</w:t>
     </w:r>
   </w:p>
 </w:hdr>

</xml_diff>